<commit_message>
Mejoramiento de portada de manuales
</commit_message>
<xml_diff>
--- a/Manual Técnico Sena Contigo Flutter.docx
+++ b/Manual Técnico Sena Contigo Flutter.docx
@@ -22571,25 +22571,7 @@
         <w:rPr>
           <w:lang w:val="es-CO"/>
         </w:rPr>
-        <w:t xml:space="preserve"> COOMMIT</w:t>
-      </w:r>
-      <w:r>
-        <w:rPr>
-          <w:lang w:val="es-CO"/>
-        </w:rPr>
-        <w:t xml:space="preserve"> COMMIT </w:t>
-      </w:r>
-      <w:r>
-        <w:rPr>
-          <w:lang w:val="es-CO"/>
-        </w:rPr>
-        <w:t xml:space="preserve">COMMIT </w:t>
-      </w:r>
-      <w:r>
-        <w:rPr>
-          <w:lang w:val="es-CO"/>
-        </w:rPr>
-        <w:t>COMMIT</w:t>
+        <w:t xml:space="preserve"> </w:t>
       </w:r>
       <w:bookmarkStart w:id="67" w:name="_GoBack"/>
       <w:bookmarkEnd w:id="67"/>

</xml_diff>